<commit_message>
independent verification of every number; citation fixes it found
TNBC: 30 adsorptions re-run (identical), cage intact in all, docking/redocking/identity/QSPR identical.
Tau: 28 adsorptions re-run (identical), carrier reference, 4 docking controls, identity, QSPR identical;
     EGCG claim now cites Wobst et al. 2015 (Seidler et al. 2018 was about peptide inhibitors).
Methods: GBM lattice scan re-run (identical), flake tests vs raw outputs, fabricated-screen script;
     intro refs replaced by papers that propose the materials as drug carriers.
See results/verification/VERIFICATION_REPORT.md (data/VERIFICATION_REPORT.md for Methods).

Co-Authored-By: Claude Opus 5.5 <noreply@anthropic.com>
</commit_message>
<xml_diff>
--- a/manuscript/submission/Manuscript_Audit_JCBC.docx
+++ b/manuscript/submission/Manuscript_Audit_JCBC.docx
@@ -221,7 +221,7 @@
         <w:rPr>
           <w:vertAlign w:val="superscript"/>
         </w:rPr>
-        <w:t>1–5</w:t>
+        <w:t>1–4</w:t>
       </w:r>
       <w:r>
         <w:rPr/>
@@ -231,7 +231,7 @@
         <w:rPr>
           <w:vertAlign w:val="superscript"/>
         </w:rPr>
-        <w:t>6</w:t>
+        <w:t>5</w:t>
       </w:r>
       <w:r>
         <w:rPr/>
@@ -241,7 +241,7 @@
         <w:rPr>
           <w:vertAlign w:val="superscript"/>
         </w:rPr>
-        <w:t>7,8</w:t>
+        <w:t>6,7</w:t>
       </w:r>
       <w:r>
         <w:rPr/>
@@ -251,7 +251,7 @@
         <w:rPr>
           <w:vertAlign w:val="superscript"/>
         </w:rPr>
-        <w:t>9–13</w:t>
+        <w:t>8–12</w:t>
       </w:r>
       <w:r>
         <w:rPr/>
@@ -261,7 +261,7 @@
         <w:rPr>
           <w:vertAlign w:val="superscript"/>
         </w:rPr>
-        <w:t>14</w:t>
+        <w:t>13</w:t>
       </w:r>
       <w:r>
         <w:rPr/>
@@ -281,7 +281,7 @@
         <w:rPr>
           <w:vertAlign w:val="superscript"/>
         </w:rPr>
-        <w:t>15–17</w:t>
+        <w:t>14–16</w:t>
       </w:r>
       <w:r>
         <w:rPr/>
@@ -291,7 +291,7 @@
         <w:rPr>
           <w:vertAlign w:val="superscript"/>
         </w:rPr>
-        <w:t>18,19</w:t>
+        <w:t>17,18</w:t>
       </w:r>
       <w:r>
         <w:rPr/>
@@ -301,7 +301,7 @@
         <w:rPr>
           <w:vertAlign w:val="superscript"/>
         </w:rPr>
-        <w:t>20</w:t>
+        <w:t>19</w:t>
       </w:r>
       <w:r>
         <w:rPr/>
@@ -461,7 +461,7 @@
         <w:rPr>
           <w:vertAlign w:val="superscript"/>
         </w:rPr>
-        <w:t>21–25</w:t>
+        <w:t>20–24</w:t>
       </w:r>
       <w:r>
         <w:rPr/>
@@ -662,7 +662,7 @@
         <w:rPr>
           <w:vertAlign w:val="superscript"/>
         </w:rPr>
-        <w:t>26</w:t>
+        <w:t>25</w:t>
       </w:r>
       <w:r>
         <w:rPr/>
@@ -800,7 +800,7 @@
         <w:rPr>
           <w:vertAlign w:val="superscript"/>
         </w:rPr>
-        <w:t>6</w:t>
+        <w:t>5</w:t>
       </w:r>
       <w:r>
         <w:rPr/>
@@ -810,7 +810,7 @@
         <w:rPr>
           <w:vertAlign w:val="superscript"/>
         </w:rPr>
-        <w:t>27</w:t>
+        <w:t>26</w:t>
       </w:r>
       <w:r>
         <w:rPr/>
@@ -836,7 +836,7 @@
         <w:rPr>
           <w:vertAlign w:val="superscript"/>
         </w:rPr>
-        <w:t>28</w:t>
+        <w:t>27</w:t>
       </w:r>
       <w:r>
         <w:rPr/>
@@ -894,7 +894,7 @@
         <w:rPr>
           <w:vertAlign w:val="superscript"/>
         </w:rPr>
-        <w:t>29</w:t>
+        <w:t>28</w:t>
       </w:r>
       <w:r>
         <w:rPr/>
@@ -904,7 +904,7 @@
         <w:rPr>
           <w:vertAlign w:val="superscript"/>
         </w:rPr>
-        <w:t>12</w:t>
+        <w:t>11</w:t>
       </w:r>
       <w:r>
         <w:rPr/>
@@ -914,7 +914,7 @@
         <w:rPr>
           <w:vertAlign w:val="superscript"/>
         </w:rPr>
-        <w:t>9,10</w:t>
+        <w:t>8,9</w:t>
       </w:r>
       <w:r>
         <w:rPr/>
@@ -943,7 +943,7 @@
         <w:rPr>
           <w:vertAlign w:val="superscript"/>
         </w:rPr>
-        <w:t>8</w:t>
+        <w:t>7</w:t>
       </w:r>
       <w:r>
         <w:rPr/>
@@ -953,7 +953,7 @@
         <w:rPr>
           <w:vertAlign w:val="superscript"/>
         </w:rPr>
-        <w:t>30</w:t>
+        <w:t>29</w:t>
       </w:r>
       <w:r>
         <w:rPr/>
@@ -963,7 +963,7 @@
         <w:rPr>
           <w:vertAlign w:val="superscript"/>
         </w:rPr>
-        <w:t>31</w:t>
+        <w:t>30</w:t>
       </w:r>
       <w:r>
         <w:rPr/>
@@ -973,7 +973,7 @@
         <w:rPr>
           <w:vertAlign w:val="superscript"/>
         </w:rPr>
-        <w:t>32</w:t>
+        <w:t>31</w:t>
       </w:r>
       <w:r>
         <w:rPr/>
@@ -1710,7 +1710,7 @@
         <w:rPr>
           <w:vertAlign w:val="superscript"/>
         </w:rPr>
-        <w:t>15,17</w:t>
+        <w:t>14,16</w:t>
       </w:r>
       <w:r>
         <w:rPr/>
@@ -1759,7 +1759,7 @@
         <w:rPr>
           <w:vertAlign w:val="superscript"/>
         </w:rPr>
-        <w:t>5</w:t>
+        <w:t>32</w:t>
       </w:r>
       <w:r>
         <w:rPr/>
@@ -1815,7 +1815,7 @@
         <w:rPr>
           <w:vertAlign w:val="superscript"/>
         </w:rPr>
-        <w:t>1</w:t>
+        <w:t>33</w:t>
       </w:r>
       <w:r>
         <w:rPr/>
@@ -2095,7 +2095,7 @@
         <w:rPr>
           <w:vertAlign w:val="superscript"/>
         </w:rPr>
-        <w:t>24</w:t>
+        <w:t>23</w:t>
       </w:r>
       <w:r>
         <w:rPr/>
@@ -2105,7 +2105,7 @@
         <w:rPr>
           <w:vertAlign w:val="superscript"/>
         </w:rPr>
-        <w:t>3,4</w:t>
+        <w:t>34,35</w:t>
       </w:r>
       <w:r>
         <w:rPr/>
@@ -2358,7 +2358,7 @@
         <w:rPr>
           <w:vertAlign w:val="superscript"/>
         </w:rPr>
-        <w:t>33</w:t>
+        <w:t>36</w:t>
       </w:r>
       <w:r>
         <w:rPr/>
@@ -2368,7 +2368,7 @@
         <w:rPr>
           <w:vertAlign w:val="superscript"/>
         </w:rPr>
-        <w:t>6,27</w:t>
+        <w:t>5,26</w:t>
       </w:r>
       <w:r>
         <w:rPr/>
@@ -2501,7 +2501,7 @@
         <w:rPr>
           <w:vertAlign w:val="superscript"/>
         </w:rPr>
-        <w:t>34</w:t>
+        <w:t>37</w:t>
       </w:r>
       <w:r>
         <w:rPr/>
@@ -2511,7 +2511,7 @@
         <w:rPr>
           <w:vertAlign w:val="superscript"/>
         </w:rPr>
-        <w:t>35</w:t>
+        <w:t>38</w:t>
       </w:r>
       <w:r>
         <w:rPr/>
@@ -2531,7 +2531,7 @@
         <w:rPr>
           <w:vertAlign w:val="superscript"/>
         </w:rPr>
-        <w:t>18,19</w:t>
+        <w:t>17,18</w:t>
       </w:r>
       <w:r>
         <w:rPr/>
@@ -3649,14 +3649,14 @@
         <w:rPr>
           <w:sz w:val="20"/>
         </w:rPr>
-        <w:t xml:space="preserve">(1) Kroke, E.; Schwarz, M.; Horath-Bordon, E.; Kroll, P.; Noll, B.; Norman, A. D. Tri-s-triazine derivatives. Part I. From trichloro-tri-s-triazine to graphitic C3N4 structures. </w:t>
+        <w:t xml:space="preserve">(1) Pourmadadi, M.; Rahmani, E.; Eshaghi, M. M.; Shamsabadipour, A.; Ghotekar, S.; Rahdar, A.; Romanholo Ferreira, L. F. Graphitic carbon nitride (g-C3N4) synthesis methods, surface functionalization, and drug delivery applications: A review. </w:t>
       </w:r>
       <w:r>
         <w:rPr>
           <w:i/>
           <w:sz w:val="20"/>
         </w:rPr>
-        <w:t>New J. Chem.</w:t>
+        <w:t>J. Drug Delivery Sci. Technol.</w:t>
       </w:r>
       <w:r>
         <w:rPr>
@@ -3669,7 +3669,7 @@
           <w:b/>
           <w:sz w:val="20"/>
         </w:rPr>
-        <w:t>2002</w:t>
+        <w:t>2023</w:t>
       </w:r>
       <w:r>
         <w:rPr>
@@ -3682,13 +3682,13 @@
           <w:i/>
           <w:sz w:val="20"/>
         </w:rPr>
-        <w:t>26</w:t>
+        <w:t>79</w:t>
       </w:r>
       <w:r>
         <w:rPr>
           <w:sz w:val="20"/>
         </w:rPr>
-        <w:t>, 508–512. https://doi.org/10.1039/b111062b</w:t>
+        <w:t>, 104001. https://doi.org/10.1016/j.jddst.2022.104001</w:t>
       </w:r>
     </w:p>
     <w:p>
@@ -3700,14 +3700,14 @@
         <w:rPr>
           <w:sz w:val="20"/>
         </w:rPr>
-        <w:t xml:space="preserve">(2) Naguib, M.; Kurtoglu, M.; Presser, V.; Lu, J.; Niu, J.; Heon, M.; Hultman, L.; Gogotsi, Y.; Barsoum, M. W. Two-Dimensional Nanocrystals Produced by Exfoliation of Ti3AlC2. </w:t>
+        <w:t xml:space="preserve">(2) Huang, K.; Li, Z.; Lin, J.; Han, G.; Huang, P. Two-dimensional transition metal carbides and nitrides (MXenes) for biomedical applications. </w:t>
       </w:r>
       <w:r>
         <w:rPr>
           <w:i/>
           <w:sz w:val="20"/>
         </w:rPr>
-        <w:t>Adv. Mater.</w:t>
+        <w:t>Chem. Soc. Rev.</w:t>
       </w:r>
       <w:r>
         <w:rPr>
@@ -3720,7 +3720,7 @@
           <w:b/>
           <w:sz w:val="20"/>
         </w:rPr>
-        <w:t>2011</w:t>
+        <w:t>2018</w:t>
       </w:r>
       <w:r>
         <w:rPr>
@@ -3733,13 +3733,13 @@
           <w:i/>
           <w:sz w:val="20"/>
         </w:rPr>
-        <w:t>23</w:t>
+        <w:t>47</w:t>
       </w:r>
       <w:r>
         <w:rPr>
           <w:sz w:val="20"/>
         </w:rPr>
-        <w:t>, 4248–4253. https://doi.org/10.1002/adma.201102306</w:t>
+        <w:t>, 5109–5124. https://doi.org/10.1039/c7cs00838d</w:t>
       </w:r>
     </w:p>
     <w:p>
@@ -3751,14 +3751,14 @@
         <w:rPr>
           <w:sz w:val="20"/>
         </w:rPr>
-        <w:t xml:space="preserve">(3) Mannix, A. J.; Zhou, X.-F.; Kiraly, B.; Wood, J. D.; Alducin, D.; Myers, B. D.; Liu, X.; Fisher, B. L.; Santiago, U.; Guest, J. R.; Yacaman, M. J.; Ponce, A.; Oganov, A. R.; Hersam, M. C.; Guisinger, N. P. Synthesis of borophenes: Anisotropic, two-dimensional boron polymorphs. </w:t>
+        <w:t xml:space="preserve">(3) Li, W.; Zhao, T. Borophene as an carrier for mercaptopurine drug: electronic study via density‐functional theory computations. </w:t>
       </w:r>
       <w:r>
         <w:rPr>
           <w:i/>
           <w:sz w:val="20"/>
         </w:rPr>
-        <w:t>Science</w:t>
+        <w:t>J. Mol. Model.</w:t>
       </w:r>
       <w:r>
         <w:rPr>
@@ -3771,7 +3771,7 @@
           <w:b/>
           <w:sz w:val="20"/>
         </w:rPr>
-        <w:t>2015</w:t>
+        <w:t>2023</w:t>
       </w:r>
       <w:r>
         <w:rPr>
@@ -3784,13 +3784,13 @@
           <w:i/>
           <w:sz w:val="20"/>
         </w:rPr>
-        <w:t>350</w:t>
+        <w:t>29</w:t>
       </w:r>
       <w:r>
         <w:rPr>
           <w:sz w:val="20"/>
         </w:rPr>
-        <w:t>, 1513–1516. https://doi.org/10.1126/science.aad1080</w:t>
+        <w:t>, 325. https://doi.org/10.1007/s00894-023-05724-z</w:t>
       </w:r>
     </w:p>
     <w:p>
@@ -3802,14 +3802,14 @@
         <w:rPr>
           <w:sz w:val="20"/>
         </w:rPr>
-        <w:t xml:space="preserve">(4) Feng, B.; Zhang, J.; Zhong, Q.; Li, W.; Li, S.; Li, H.; Cheng, P.; Meng, S.; Chen, L.; Wu, K. Experimental realization of two-dimensional boron sheets. </w:t>
+        <w:t xml:space="preserve">(4) Gholami, A.; Shakerzadeh, E.; Chigo Anota, E. Exploring the potential use of pristine and metal-encapsulated B36N36 fullerenes in delivery of β-lapachone anticancer drug: DFT approach. </w:t>
       </w:r>
       <w:r>
         <w:rPr>
           <w:i/>
           <w:sz w:val="20"/>
         </w:rPr>
-        <w:t>Nat. Chem.</w:t>
+        <w:t>Polyhedron</w:t>
       </w:r>
       <w:r>
         <w:rPr>
@@ -3822,7 +3822,7 @@
           <w:b/>
           <w:sz w:val="20"/>
         </w:rPr>
-        <w:t>2016</w:t>
+        <w:t>2023</w:t>
       </w:r>
       <w:r>
         <w:rPr>
@@ -3835,13 +3835,13 @@
           <w:i/>
           <w:sz w:val="20"/>
         </w:rPr>
-        <w:t>8</w:t>
+        <w:t>232</w:t>
       </w:r>
       <w:r>
         <w:rPr>
           <w:sz w:val="20"/>
         </w:rPr>
-        <w:t>, 563–568. https://doi.org/10.1038/nchem.2491</w:t>
+        <w:t>, 116295. https://doi.org/10.1016/j.poly.2023.116295</w:t>
       </w:r>
     </w:p>
     <w:p>
@@ -3853,14 +3853,14 @@
         <w:rPr>
           <w:sz w:val="20"/>
         </w:rPr>
-        <w:t xml:space="preserve">(5) Strout, D. L. Structure and Stability of Boron Nitrides: Isomers of B12N12. </w:t>
+        <w:t xml:space="preserve">(5) Bannwarth, C.; Ehlert, S.; Grimme, S. GFN2-xTB─An Accurate and Broadly Parametrized Self-Consistent Tight-Binding Quantum Chemical Method with Multipole Electrostatics and Density-Dependent Dispersion Contributions. </w:t>
       </w:r>
       <w:r>
         <w:rPr>
           <w:i/>
           <w:sz w:val="20"/>
         </w:rPr>
-        <w:t>J. Phys. Chem. A</w:t>
+        <w:t>J. Chem. Theory Comput.</w:t>
       </w:r>
       <w:r>
         <w:rPr>
@@ -3873,7 +3873,7 @@
           <w:b/>
           <w:sz w:val="20"/>
         </w:rPr>
-        <w:t>2000</w:t>
+        <w:t>2019</w:t>
       </w:r>
       <w:r>
         <w:rPr>
@@ -3886,13 +3886,13 @@
           <w:i/>
           <w:sz w:val="20"/>
         </w:rPr>
-        <w:t>104</w:t>
+        <w:t>15</w:t>
       </w:r>
       <w:r>
         <w:rPr>
           <w:sz w:val="20"/>
         </w:rPr>
-        <w:t>, 3364–3366. https://doi.org/10.1021/jp994129a</w:t>
+        <w:t>, 1652–1671. https://doi.org/10.1021/acs.jctc.8b01176</w:t>
       </w:r>
     </w:p>
     <w:p>
@@ -3904,14 +3904,14 @@
         <w:rPr>
           <w:sz w:val="20"/>
         </w:rPr>
-        <w:t xml:space="preserve">(6) Bannwarth, C.; Ehlert, S.; Grimme, S. GFN2-xTB─An Accurate and Broadly Parametrized Self-Consistent Tight-Binding Quantum Chemical Method with Multipole Electrostatics and Density-Dependent Dispersion Contributions. </w:t>
+        <w:t xml:space="preserve">(6) Trott, O.; Olson, A. J. AutoDock Vina: Improving the speed and accuracy of docking with a new scoring function, efficient optimization, and multithreading. </w:t>
       </w:r>
       <w:r>
         <w:rPr>
           <w:i/>
           <w:sz w:val="20"/>
         </w:rPr>
-        <w:t>J. Chem. Theory Comput.</w:t>
+        <w:t>J. Comput. Chem.</w:t>
       </w:r>
       <w:r>
         <w:rPr>
@@ -3924,7 +3924,7 @@
           <w:b/>
           <w:sz w:val="20"/>
         </w:rPr>
-        <w:t>2019</w:t>
+        <w:t>2010</w:t>
       </w:r>
       <w:r>
         <w:rPr>
@@ -3937,13 +3937,13 @@
           <w:i/>
           <w:sz w:val="20"/>
         </w:rPr>
-        <w:t>15</w:t>
+        <w:t>31</w:t>
       </w:r>
       <w:r>
         <w:rPr>
           <w:sz w:val="20"/>
         </w:rPr>
-        <w:t>, 1652–1671. https://doi.org/10.1021/acs.jctc.8b01176</w:t>
+        <w:t>, 455–461. https://doi.org/10.1002/jcc.21334</w:t>
       </w:r>
     </w:p>
     <w:p>
@@ -3955,14 +3955,14 @@
         <w:rPr>
           <w:sz w:val="20"/>
         </w:rPr>
-        <w:t xml:space="preserve">(7) Trott, O.; Olson, A. J. AutoDock Vina: Improving the speed and accuracy of docking with a new scoring function, efficient optimization, and multithreading. </w:t>
+        <w:t xml:space="preserve">(7) Eberhardt, J.; Santos-Martins, D.; Tillack, A. F.; Forli, S. AutoDock Vina 1.2.0: New Docking Methods, Expanded Force Field, and Python Bindings. </w:t>
       </w:r>
       <w:r>
         <w:rPr>
           <w:i/>
           <w:sz w:val="20"/>
         </w:rPr>
-        <w:t>J. Comput. Chem.</w:t>
+        <w:t>J. Chem. Inf. Model.</w:t>
       </w:r>
       <w:r>
         <w:rPr>
@@ -3975,7 +3975,7 @@
           <w:b/>
           <w:sz w:val="20"/>
         </w:rPr>
-        <w:t>2010</w:t>
+        <w:t>2021</w:t>
       </w:r>
       <w:r>
         <w:rPr>
@@ -3988,13 +3988,13 @@
           <w:i/>
           <w:sz w:val="20"/>
         </w:rPr>
-        <w:t>31</w:t>
+        <w:t>61</w:t>
       </w:r>
       <w:r>
         <w:rPr>
           <w:sz w:val="20"/>
         </w:rPr>
-        <w:t>, 455–461. https://doi.org/10.1002/jcc.21334</w:t>
+        <w:t>, 3891–3898. https://doi.org/10.1021/acs.jcim.1c00203</w:t>
       </w:r>
     </w:p>
     <w:p>
@@ -4006,46 +4006,7 @@
         <w:rPr>
           <w:sz w:val="20"/>
         </w:rPr>
-        <w:t xml:space="preserve">(8) Eberhardt, J.; Santos-Martins, D.; Tillack, A. F.; Forli, S. AutoDock Vina 1.2.0: New Docking Methods, Expanded Force Field, and Python Bindings. </w:t>
-      </w:r>
-      <w:r>
-        <w:rPr>
-          <w:i/>
-          <w:sz w:val="20"/>
-        </w:rPr>
-        <w:t>J. Chem. Inf. Model.</w:t>
-      </w:r>
-      <w:r>
-        <w:rPr>
-          <w:sz w:val="20"/>
-        </w:rPr>
-        <w:t xml:space="preserve"> </w:t>
-      </w:r>
-      <w:r>
-        <w:rPr>
-          <w:b/>
-          <w:sz w:val="20"/>
-        </w:rPr>
-        <w:t>2021</w:t>
-      </w:r>
-      <w:r>
-        <w:rPr>
-          <w:sz w:val="20"/>
-        </w:rPr>
-        <w:t xml:space="preserve">, </w:t>
-      </w:r>
-      <w:r>
-        <w:rPr>
-          <w:i/>
-          <w:sz w:val="20"/>
-        </w:rPr>
-        <w:t>61</w:t>
-      </w:r>
-      <w:r>
-        <w:rPr>
-          <w:sz w:val="20"/>
-        </w:rPr>
-        <w:t>, 3891–3898. https://doi.org/10.1021/acs.jcim.1c00203</w:t>
+        <w:t>(8) OECD. Guidance Document on the Validation of (Quantitative) Structure-Activity Relationship [(Q)SAR] Models; OECD Series on Testing and Assessment, No. 69; OECD Publishing: Paris, 2007.</w:t>
       </w:r>
     </w:p>
     <w:p>
@@ -4057,7 +4018,46 @@
         <w:rPr>
           <w:sz w:val="20"/>
         </w:rPr>
-        <w:t>(9) OECD. Guidance Document on the Validation of (Quantitative) Structure-Activity Relationship [(Q)SAR] Models; OECD Series on Testing and Assessment, No. 69; OECD Publishing: Paris, 2007.</w:t>
+        <w:t xml:space="preserve">(9) Tropsha, A. Best Practices for QSAR Model Development, Validation, and Exploitation. </w:t>
+      </w:r>
+      <w:r>
+        <w:rPr>
+          <w:i/>
+          <w:sz w:val="20"/>
+        </w:rPr>
+        <w:t>Mol. Inf.</w:t>
+      </w:r>
+      <w:r>
+        <w:rPr>
+          <w:sz w:val="20"/>
+        </w:rPr>
+        <w:t xml:space="preserve"> </w:t>
+      </w:r>
+      <w:r>
+        <w:rPr>
+          <w:b/>
+          <w:sz w:val="20"/>
+        </w:rPr>
+        <w:t>2010</w:t>
+      </w:r>
+      <w:r>
+        <w:rPr>
+          <w:sz w:val="20"/>
+        </w:rPr>
+        <w:t xml:space="preserve">, </w:t>
+      </w:r>
+      <w:r>
+        <w:rPr>
+          <w:i/>
+          <w:sz w:val="20"/>
+        </w:rPr>
+        <w:t>29</w:t>
+      </w:r>
+      <w:r>
+        <w:rPr>
+          <w:sz w:val="20"/>
+        </w:rPr>
+        <w:t>, 476–488. https://doi.org/10.1002/minf.201000061</w:t>
       </w:r>
     </w:p>
     <w:p>
@@ -4069,14 +4069,14 @@
         <w:rPr>
           <w:sz w:val="20"/>
         </w:rPr>
-        <w:t xml:space="preserve">(10) Tropsha, A. Best Practices for QSAR Model Development, Validation, and Exploitation. </w:t>
+        <w:t xml:space="preserve">(10) Gramatica, P. Principles of QSAR models validation: internal and external. </w:t>
       </w:r>
       <w:r>
         <w:rPr>
           <w:i/>
           <w:sz w:val="20"/>
         </w:rPr>
-        <w:t>Mol. Inf.</w:t>
+        <w:t>QSAR Comb. Sci.</w:t>
       </w:r>
       <w:r>
         <w:rPr>
@@ -4089,7 +4089,7 @@
           <w:b/>
           <w:sz w:val="20"/>
         </w:rPr>
-        <w:t>2010</w:t>
+        <w:t>2007</w:t>
       </w:r>
       <w:r>
         <w:rPr>
@@ -4102,13 +4102,13 @@
           <w:i/>
           <w:sz w:val="20"/>
         </w:rPr>
-        <w:t>29</w:t>
+        <w:t>26</w:t>
       </w:r>
       <w:r>
         <w:rPr>
           <w:sz w:val="20"/>
         </w:rPr>
-        <w:t>, 476–488. https://doi.org/10.1002/minf.201000061</w:t>
+        <w:t>, 694–701. https://doi.org/10.1002/qsar.200610151</w:t>
       </w:r>
     </w:p>
     <w:p>
@@ -4120,14 +4120,14 @@
         <w:rPr>
           <w:sz w:val="20"/>
         </w:rPr>
-        <w:t xml:space="preserve">(11) Gramatica, P. Principles of QSAR models validation: internal and external. </w:t>
+        <w:t xml:space="preserve">(11) Rücker, C.; Rücker, G.; Meringer, M. y-Randomization and Its Variants in QSPR/QSAR. </w:t>
       </w:r>
       <w:r>
         <w:rPr>
           <w:i/>
           <w:sz w:val="20"/>
         </w:rPr>
-        <w:t>QSAR Comb. Sci.</w:t>
+        <w:t>J. Chem. Inf. Model.</w:t>
       </w:r>
       <w:r>
         <w:rPr>
@@ -4153,13 +4153,13 @@
           <w:i/>
           <w:sz w:val="20"/>
         </w:rPr>
-        <w:t>26</w:t>
+        <w:t>47</w:t>
       </w:r>
       <w:r>
         <w:rPr>
           <w:sz w:val="20"/>
         </w:rPr>
-        <w:t>, 694–701. https://doi.org/10.1002/qsar.200610151</w:t>
+        <w:t>, 2345–2357. https://doi.org/10.1021/ci700157b</w:t>
       </w:r>
     </w:p>
     <w:p>
@@ -4171,14 +4171,14 @@
         <w:rPr>
           <w:sz w:val="20"/>
         </w:rPr>
-        <w:t xml:space="preserve">(12) Rücker, C.; Rücker, G.; Meringer, M. y-Randomization and Its Variants in QSPR/QSAR. </w:t>
+        <w:t xml:space="preserve">(12) Cherkasov, A.; Muratov, E. N.; Fourches, D.; Varnek, A.; Baskin, I. I.; Cronin, M.; Dearden, J.; Gramatica, P.; Martin, Y. C.; Todeschini, R.; Consonni, V.; Kuz’min, V. E.; Cramer, R.; Benigni, R.; Yang, C.; Rathman, J.; Terfloth, L.; Gasteiger, J.; Richard, A.; Tropsha, A. QSAR Modeling: Where Have You Been? Where Are You Going To?. </w:t>
       </w:r>
       <w:r>
         <w:rPr>
           <w:i/>
           <w:sz w:val="20"/>
         </w:rPr>
-        <w:t>J. Chem. Inf. Model.</w:t>
+        <w:t>J. Med. Chem.</w:t>
       </w:r>
       <w:r>
         <w:rPr>
@@ -4191,7 +4191,7 @@
           <w:b/>
           <w:sz w:val="20"/>
         </w:rPr>
-        <w:t>2007</w:t>
+        <w:t>2014</w:t>
       </w:r>
       <w:r>
         <w:rPr>
@@ -4204,13 +4204,13 @@
           <w:i/>
           <w:sz w:val="20"/>
         </w:rPr>
-        <w:t>47</w:t>
+        <w:t>57</w:t>
       </w:r>
       <w:r>
         <w:rPr>
           <w:sz w:val="20"/>
         </w:rPr>
-        <w:t>, 2345–2357. https://doi.org/10.1021/ci700157b</w:t>
+        <w:t>, 4977–5010. https://doi.org/10.1021/jm4004285</w:t>
       </w:r>
     </w:p>
     <w:p>
@@ -4222,14 +4222,14 @@
         <w:rPr>
           <w:sz w:val="20"/>
         </w:rPr>
-        <w:t xml:space="preserve">(13) Cherkasov, A.; Muratov, E. N.; Fourches, D.; Varnek, A.; Baskin, I. I.; Cronin, M.; Dearden, J.; Gramatica, P.; Martin, Y. C.; Todeschini, R.; Consonni, V.; Kuz’min, V. E.; Cramer, R.; Benigni, R.; Yang, C.; Rathman, J.; Terfloth, L.; Gasteiger, J.; Richard, A.; Tropsha, A. QSAR Modeling: Where Have You Been? Where Are You Going To?. </w:t>
+        <w:t xml:space="preserve">(13) Kapoor, S.; Narayanan, A. Leakage and the reproducibility crisis in machine-learning-based science. </w:t>
       </w:r>
       <w:r>
         <w:rPr>
           <w:i/>
           <w:sz w:val="20"/>
         </w:rPr>
-        <w:t>J. Med. Chem.</w:t>
+        <w:t>Patterns</w:t>
       </w:r>
       <w:r>
         <w:rPr>
@@ -4242,7 +4242,7 @@
           <w:b/>
           <w:sz w:val="20"/>
         </w:rPr>
-        <w:t>2014</w:t>
+        <w:t>2023</w:t>
       </w:r>
       <w:r>
         <w:rPr>
@@ -4255,13 +4255,13 @@
           <w:i/>
           <w:sz w:val="20"/>
         </w:rPr>
-        <w:t>57</w:t>
+        <w:t>4</w:t>
       </w:r>
       <w:r>
         <w:rPr>
           <w:sz w:val="20"/>
         </w:rPr>
-        <w:t>, 4977–5010. https://doi.org/10.1021/jm4004285</w:t>
+        <w:t>, 100804. https://doi.org/10.1016/j.patter.2023.100804</w:t>
       </w:r>
     </w:p>
     <w:p>
@@ -4273,14 +4273,14 @@
         <w:rPr>
           <w:sz w:val="20"/>
         </w:rPr>
-        <w:t xml:space="preserve">(14) Kapoor, S.; Narayanan, A. Leakage and the reproducibility crisis in machine-learning-based science. </w:t>
+        <w:t xml:space="preserve">(14) Fourches, D.; Muratov, E.; Tropsha, A. Trust, But Verify: On the Importance of Chemical Structure Curation in Cheminformatics and QSAR Modeling Research. </w:t>
       </w:r>
       <w:r>
         <w:rPr>
           <w:i/>
           <w:sz w:val="20"/>
         </w:rPr>
-        <w:t>Patterns</w:t>
+        <w:t>J. Chem. Inf. Model.</w:t>
       </w:r>
       <w:r>
         <w:rPr>
@@ -4293,7 +4293,7 @@
           <w:b/>
           <w:sz w:val="20"/>
         </w:rPr>
-        <w:t>2023</w:t>
+        <w:t>2010</w:t>
       </w:r>
       <w:r>
         <w:rPr>
@@ -4306,13 +4306,13 @@
           <w:i/>
           <w:sz w:val="20"/>
         </w:rPr>
-        <w:t>4</w:t>
+        <w:t>50</w:t>
       </w:r>
       <w:r>
         <w:rPr>
           <w:sz w:val="20"/>
         </w:rPr>
-        <w:t>, 100804. https://doi.org/10.1016/j.patter.2023.100804</w:t>
+        <w:t>, 1189–1204. https://doi.org/10.1021/ci100176x</w:t>
       </w:r>
     </w:p>
     <w:p>
@@ -4324,7 +4324,7 @@
         <w:rPr>
           <w:sz w:val="20"/>
         </w:rPr>
-        <w:t xml:space="preserve">(15) Fourches, D.; Muratov, E.; Tropsha, A. Trust, But Verify: On the Importance of Chemical Structure Curation in Cheminformatics and QSAR Modeling Research. </w:t>
+        <w:t xml:space="preserve">(15) Fourches, D.; Muratov, E.; Tropsha, A. Trust, but Verify II: A Practical Guide to Chemogenomics Data Curation. </w:t>
       </w:r>
       <w:r>
         <w:rPr>
@@ -4344,7 +4344,7 @@
           <w:b/>
           <w:sz w:val="20"/>
         </w:rPr>
-        <w:t>2010</w:t>
+        <w:t>2016</w:t>
       </w:r>
       <w:r>
         <w:rPr>
@@ -4357,13 +4357,13 @@
           <w:i/>
           <w:sz w:val="20"/>
         </w:rPr>
-        <w:t>50</w:t>
+        <w:t>56</w:t>
       </w:r>
       <w:r>
         <w:rPr>
           <w:sz w:val="20"/>
         </w:rPr>
-        <w:t>, 1189–1204. https://doi.org/10.1021/ci100176x</w:t>
+        <w:t>, 1243–1252. https://doi.org/10.1021/acs.jcim.6b00129</w:t>
       </w:r>
     </w:p>
     <w:p>
@@ -4375,14 +4375,14 @@
         <w:rPr>
           <w:sz w:val="20"/>
         </w:rPr>
-        <w:t xml:space="preserve">(16) Fourches, D.; Muratov, E.; Tropsha, A. Trust, but Verify II: A Practical Guide to Chemogenomics Data Curation. </w:t>
+        <w:t xml:space="preserve">(16) Williams, A. J.; Ekins, S. A quality alert and call for improved curation of public chemistry databases. </w:t>
       </w:r>
       <w:r>
         <w:rPr>
           <w:i/>
           <w:sz w:val="20"/>
         </w:rPr>
-        <w:t>J. Chem. Inf. Model.</w:t>
+        <w:t>Drug Discovery Today</w:t>
       </w:r>
       <w:r>
         <w:rPr>
@@ -4395,7 +4395,7 @@
           <w:b/>
           <w:sz w:val="20"/>
         </w:rPr>
-        <w:t>2016</w:t>
+        <w:t>2011</w:t>
       </w:r>
       <w:r>
         <w:rPr>
@@ -4408,13 +4408,13 @@
           <w:i/>
           <w:sz w:val="20"/>
         </w:rPr>
-        <w:t>56</w:t>
+        <w:t>16</w:t>
       </w:r>
       <w:r>
         <w:rPr>
           <w:sz w:val="20"/>
         </w:rPr>
-        <w:t>, 1243–1252. https://doi.org/10.1021/acs.jcim.6b00129</w:t>
+        <w:t>, 747–750. https://doi.org/10.1016/j.drudis.2011.07.007</w:t>
       </w:r>
     </w:p>
     <w:p>
@@ -4426,14 +4426,14 @@
         <w:rPr>
           <w:sz w:val="20"/>
         </w:rPr>
-        <w:t xml:space="preserve">(17) Williams, A. J.; Ekins, S. A quality alert and call for improved curation of public chemistry databases. </w:t>
+        <w:t xml:space="preserve">(17) Warren, G. L.; Andrews, C. W.; Capelli, A.-M.; Clarke, B.; LaLonde, J.; Lambert, M. H.; Lindvall, M.; Nevins, N.; Semus, S. F.; Senger, S.; Tedesco, G.; Wall, I. D.; Woolven, J. M.; Peishoff, C. E.; Head, M. S. A Critical Assessment of Docking Programs and Scoring Functions. </w:t>
       </w:r>
       <w:r>
         <w:rPr>
           <w:i/>
           <w:sz w:val="20"/>
         </w:rPr>
-        <w:t>Drug Discovery Today</w:t>
+        <w:t>J. Med. Chem.</w:t>
       </w:r>
       <w:r>
         <w:rPr>
@@ -4446,7 +4446,7 @@
           <w:b/>
           <w:sz w:val="20"/>
         </w:rPr>
-        <w:t>2011</w:t>
+        <w:t>2006</w:t>
       </w:r>
       <w:r>
         <w:rPr>
@@ -4459,13 +4459,13 @@
           <w:i/>
           <w:sz w:val="20"/>
         </w:rPr>
-        <w:t>16</w:t>
+        <w:t>49</w:t>
       </w:r>
       <w:r>
         <w:rPr>
           <w:sz w:val="20"/>
         </w:rPr>
-        <w:t>, 747–750. https://doi.org/10.1016/j.drudis.2011.07.007</w:t>
+        <w:t>, 5912–5931. https://doi.org/10.1021/jm050362n</w:t>
       </w:r>
     </w:p>
     <w:p>
@@ -4477,14 +4477,14 @@
         <w:rPr>
           <w:sz w:val="20"/>
         </w:rPr>
-        <w:t xml:space="preserve">(18) Warren, G. L.; Andrews, C. W.; Capelli, A.-M.; Clarke, B.; LaLonde, J.; Lambert, M. H.; Lindvall, M.; Nevins, N.; Semus, S. F.; Senger, S.; Tedesco, G.; Wall, I. D.; Woolven, J. M.; Peishoff, C. E.; Head, M. S. A Critical Assessment of Docking Programs and Scoring Functions. </w:t>
+        <w:t xml:space="preserve">(18) Bender, B. J.; Gahbauer, S.; Luttens, A.; Lyu, J.; Webb, C. M.; Stein, R. M.; Fink, E. A.; Balius, T. E.; Carlsson, J.; Irwin, J. J.; Shoichet, B. K. A practical guide to large-scale docking. </w:t>
       </w:r>
       <w:r>
         <w:rPr>
           <w:i/>
           <w:sz w:val="20"/>
         </w:rPr>
-        <w:t>J. Med. Chem.</w:t>
+        <w:t>Nat. Protoc.</w:t>
       </w:r>
       <w:r>
         <w:rPr>
@@ -4497,7 +4497,7 @@
           <w:b/>
           <w:sz w:val="20"/>
         </w:rPr>
-        <w:t>2006</w:t>
+        <w:t>2021</w:t>
       </w:r>
       <w:r>
         <w:rPr>
@@ -4510,13 +4510,13 @@
           <w:i/>
           <w:sz w:val="20"/>
         </w:rPr>
-        <w:t>49</w:t>
+        <w:t>16</w:t>
       </w:r>
       <w:r>
         <w:rPr>
           <w:sz w:val="20"/>
         </w:rPr>
-        <w:t>, 5912–5931. https://doi.org/10.1021/jm050362n</w:t>
+        <w:t>, 4799–4832. https://doi.org/10.1038/s41596-021-00597-z</w:t>
       </w:r>
     </w:p>
     <w:p>
@@ -4528,14 +4528,14 @@
         <w:rPr>
           <w:sz w:val="20"/>
         </w:rPr>
-        <w:t xml:space="preserve">(19) Bender, B. J.; Gahbauer, S.; Luttens, A.; Lyu, J.; Webb, C. M.; Stein, R. M.; Fink, E. A.; Balius, T. E.; Carlsson, J.; Irwin, J. J.; Shoichet, B. K. A practical guide to large-scale docking. </w:t>
+        <w:t xml:space="preserve">(19) Sieg, J.; Flachsenberg, F.; Rarey, M. In Need of Bias Control: Evaluating Chemical Data for Machine Learning in Structure-Based Virtual Screening. </w:t>
       </w:r>
       <w:r>
         <w:rPr>
           <w:i/>
           <w:sz w:val="20"/>
         </w:rPr>
-        <w:t>Nat. Protoc.</w:t>
+        <w:t>J. Chem. Inf. Model.</w:t>
       </w:r>
       <w:r>
         <w:rPr>
@@ -4548,7 +4548,7 @@
           <w:b/>
           <w:sz w:val="20"/>
         </w:rPr>
-        <w:t>2021</w:t>
+        <w:t>2019</w:t>
       </w:r>
       <w:r>
         <w:rPr>
@@ -4561,13 +4561,13 @@
           <w:i/>
           <w:sz w:val="20"/>
         </w:rPr>
-        <w:t>16</w:t>
+        <w:t>59</w:t>
       </w:r>
       <w:r>
         <w:rPr>
           <w:sz w:val="20"/>
         </w:rPr>
-        <w:t>, 4799–4832. https://doi.org/10.1038/s41596-021-00597-z</w:t>
+        <w:t>, 947–961. https://doi.org/10.1021/acs.jcim.8b00712</w:t>
       </w:r>
     </w:p>
     <w:p>
@@ -4579,46 +4579,7 @@
         <w:rPr>
           <w:sz w:val="20"/>
         </w:rPr>
-        <w:t xml:space="preserve">(20) Sieg, J.; Flachsenberg, F.; Rarey, M. In Need of Bias Control: Evaluating Chemical Data for Machine Learning in Structure-Based Virtual Screening. </w:t>
-      </w:r>
-      <w:r>
-        <w:rPr>
-          <w:i/>
-          <w:sz w:val="20"/>
-        </w:rPr>
-        <w:t>J. Chem. Inf. Model.</w:t>
-      </w:r>
-      <w:r>
-        <w:rPr>
-          <w:sz w:val="20"/>
-        </w:rPr>
-        <w:t xml:space="preserve"> </w:t>
-      </w:r>
-      <w:r>
-        <w:rPr>
-          <w:b/>
-          <w:sz w:val="20"/>
-        </w:rPr>
-        <w:t>2019</w:t>
-      </w:r>
-      <w:r>
-        <w:rPr>
-          <w:sz w:val="20"/>
-        </w:rPr>
-        <w:t xml:space="preserve">, </w:t>
-      </w:r>
-      <w:r>
-        <w:rPr>
-          <w:i/>
-          <w:sz w:val="20"/>
-        </w:rPr>
-        <w:t>59</w:t>
-      </w:r>
-      <w:r>
-        <w:rPr>
-          <w:sz w:val="20"/>
-        </w:rPr>
-        <w:t>, 947–961. https://doi.org/10.1021/acs.jcim.8b00712</w:t>
+        <w:t>(20) Monreal Hernández, A. Atomistic Modeling and QSPR-Guided Screening of 2D Graphitic Carbon Nitride Nanocarriers for KRAS-G12D Inhibitor Loading and Target Engagement, version 2.0.0. Zenodo, 2026. https://doi.org/10.5281/zenodo.22700431</w:t>
       </w:r>
     </w:p>
     <w:p>
@@ -4630,7 +4591,7 @@
         <w:rPr>
           <w:sz w:val="20"/>
         </w:rPr>
-        <w:t>(21) Monreal Hernández, A. Atomistic Modeling and QSPR-Guided Screening of 2D Graphitic Carbon Nitride Nanocarriers for KRAS-G12D Inhibitor Loading and Target Engagement, version 2.0.0. Zenodo, 2026. https://doi.org/10.5281/zenodo.22700431</w:t>
+        <w:t>(21) Monreal Hernández, A. Explainable AI and Quantum-Guided QSAR/QSPR Modeling of Triple-Negative Breast Cancer Therapeutics Loading on 2D Nanomaterials, version 2.0.0. Zenodo, 2026. https://doi.org/10.5281/zenodo.22700597</w:t>
       </w:r>
     </w:p>
     <w:p>
@@ -4642,7 +4603,7 @@
         <w:rPr>
           <w:sz w:val="20"/>
         </w:rPr>
-        <w:t>(22) Monreal Hernández, A. Explainable AI and Quantum-Guided QSAR/QSPR Modeling of Triple-Negative Breast Cancer Therapeutics Loading on 2D Nanomaterials, version 2.0.0. Zenodo, 2026. https://doi.org/10.5281/zenodo.22700597</w:t>
+        <w:t>(22) Monreal Hernández, A. Explainable AI and Quantum Chemical Exploration of 2D Titanium Carbide MXene (Ti3C2Tx) Nanocarriers for Glioblastoma Therapeutics, version 2.0.0. Zenodo, 2026. https://doi.org/10.5281/zenodo.22700227</w:t>
       </w:r>
     </w:p>
     <w:p>
@@ -4654,7 +4615,7 @@
         <w:rPr>
           <w:sz w:val="20"/>
         </w:rPr>
-        <w:t>(23) Monreal Hernández, A. Explainable AI and Quantum Chemical Exploration of 2D Titanium Carbide MXene (Ti3C2Tx) Nanocarriers for Glioblastoma Therapeutics, version 2.0.0. Zenodo, 2026. https://doi.org/10.5281/zenodo.22700227</w:t>
+        <w:t>(23) Monreal Hernández, A. Machine Learning-Driven Nano-QSAR and Quantum Chemical Design of Functionalized 2D Borophene Nanocarriers for Alzheimer's Tau-Targeted Therapeutics, version 2.0.1. Zenodo, 2026. https://doi.org/10.5281/zenodo.22700723</w:t>
       </w:r>
     </w:p>
     <w:p>
@@ -4666,7 +4627,7 @@
         <w:rPr>
           <w:sz w:val="20"/>
         </w:rPr>
-        <w:t>(24) Monreal Hernández, A. Machine Learning-Driven Nano-QSAR and Quantum Chemical Design of Functionalized 2D Borophene Nanocarriers for Alzheimer's Tau-Targeted Therapeutics, version 2.0.1. Zenodo, 2026. https://doi.org/10.5281/zenodo.22700723</w:t>
+        <w:t>(24) Monreal Hernández, A. Don't Fool Yourself When Screening 2D-Nanomaterial Drug Carriers: A Reproducible GFN2-xTB + Docking + Leak-Free QSAR Pipeline, Four Disease Case Studies, and a Cautionary Tale, version 1.0.1. Zenodo, 2026. https://doi.org/10.5281/zenodo.22760388</w:t>
       </w:r>
     </w:p>
     <w:p>
@@ -4678,7 +4639,46 @@
         <w:rPr>
           <w:sz w:val="20"/>
         </w:rPr>
-        <w:t>(25) Monreal Hernández, A. Don't Fool Yourself When Screening 2D-Nanomaterial Drug Carriers: A Reproducible GFN2-xTB + Docking + Leak-Free QSAR Pipeline, Four Disease Case Studies, and a Cautionary Tale, version 1.0.1. Zenodo, 2026. https://doi.org/10.5281/zenodo.22760388</w:t>
+        <w:t xml:space="preserve">(25) Kim, S.; Chen, J.; Cheng, T.; Gindulyte, A.; He, J.; He, S.; Li, Q.; Shoemaker, B. A.; Thiessen, P. A.; Yu, B.; Zaslavsky, L.; Zhang, J.; Bolton, E. E. PubChem in 2021: new data content and improved web interfaces. </w:t>
+      </w:r>
+      <w:r>
+        <w:rPr>
+          <w:i/>
+          <w:sz w:val="20"/>
+        </w:rPr>
+        <w:t>Nucleic Acids Res.</w:t>
+      </w:r>
+      <w:r>
+        <w:rPr>
+          <w:sz w:val="20"/>
+        </w:rPr>
+        <w:t xml:space="preserve"> </w:t>
+      </w:r>
+      <w:r>
+        <w:rPr>
+          <w:b/>
+          <w:sz w:val="20"/>
+        </w:rPr>
+        <w:t>2021</w:t>
+      </w:r>
+      <w:r>
+        <w:rPr>
+          <w:sz w:val="20"/>
+        </w:rPr>
+        <w:t xml:space="preserve">, </w:t>
+      </w:r>
+      <w:r>
+        <w:rPr>
+          <w:i/>
+          <w:sz w:val="20"/>
+        </w:rPr>
+        <w:t>49</w:t>
+      </w:r>
+      <w:r>
+        <w:rPr>
+          <w:sz w:val="20"/>
+        </w:rPr>
+        <w:t>, D1388–D1395. https://doi.org/10.1093/nar/gkaa971</w:t>
       </w:r>
     </w:p>
     <w:p>
@@ -4690,14 +4690,14 @@
         <w:rPr>
           <w:sz w:val="20"/>
         </w:rPr>
-        <w:t xml:space="preserve">(26) Kim, S.; Chen, J.; Cheng, T.; Gindulyte, A.; He, J.; He, S.; Li, Q.; Shoemaker, B. A.; Thiessen, P. A.; Yu, B.; Zaslavsky, L.; Zhang, J.; Bolton, E. E. PubChem in 2021: new data content and improved web interfaces. </w:t>
+        <w:t xml:space="preserve">(26) Grimme, S.; Bannwarth, C.; Shushkov, P. A Robust and Accurate Tight-Binding Quantum Chemical Method for Structures, Vibrational Frequencies, and Noncovalent Interactions of Large Molecular Systems Parametrized for All spd-Block Elements ( Z = 1–86). </w:t>
       </w:r>
       <w:r>
         <w:rPr>
           <w:i/>
           <w:sz w:val="20"/>
         </w:rPr>
-        <w:t>Nucleic Acids Res.</w:t>
+        <w:t>J. Chem. Theory Comput.</w:t>
       </w:r>
       <w:r>
         <w:rPr>
@@ -4710,7 +4710,7 @@
           <w:b/>
           <w:sz w:val="20"/>
         </w:rPr>
-        <w:t>2021</w:t>
+        <w:t>2017</w:t>
       </w:r>
       <w:r>
         <w:rPr>
@@ -4723,13 +4723,13 @@
           <w:i/>
           <w:sz w:val="20"/>
         </w:rPr>
-        <w:t>49</w:t>
+        <w:t>13</w:t>
       </w:r>
       <w:r>
         <w:rPr>
           <w:sz w:val="20"/>
         </w:rPr>
-        <w:t>, D1388–D1395. https://doi.org/10.1093/nar/gkaa971</w:t>
+        <w:t>, 1989–2009. https://doi.org/10.1021/acs.jctc.7b00118</w:t>
       </w:r>
     </w:p>
     <w:p>
@@ -4741,46 +4741,7 @@
         <w:rPr>
           <w:sz w:val="20"/>
         </w:rPr>
-        <w:t xml:space="preserve">(27) Grimme, S.; Bannwarth, C.; Shushkov, P. A Robust and Accurate Tight-Binding Quantum Chemical Method for Structures, Vibrational Frequencies, and Noncovalent Interactions of Large Molecular Systems Parametrized for All spd-Block Elements ( Z = 1–86). </w:t>
-      </w:r>
-      <w:r>
-        <w:rPr>
-          <w:i/>
-          <w:sz w:val="20"/>
-        </w:rPr>
-        <w:t>J. Chem. Theory Comput.</w:t>
-      </w:r>
-      <w:r>
-        <w:rPr>
-          <w:sz w:val="20"/>
-        </w:rPr>
-        <w:t xml:space="preserve"> </w:t>
-      </w:r>
-      <w:r>
-        <w:rPr>
-          <w:b/>
-          <w:sz w:val="20"/>
-        </w:rPr>
-        <w:t>2017</w:t>
-      </w:r>
-      <w:r>
-        <w:rPr>
-          <w:sz w:val="20"/>
-        </w:rPr>
-        <w:t xml:space="preserve">, </w:t>
-      </w:r>
-      <w:r>
-        <w:rPr>
-          <w:i/>
-          <w:sz w:val="20"/>
-        </w:rPr>
-        <w:t>13</w:t>
-      </w:r>
-      <w:r>
-        <w:rPr>
-          <w:sz w:val="20"/>
-        </w:rPr>
-        <w:t>, 1989–2009. https://doi.org/10.1021/acs.jctc.7b00118</w:t>
+        <w:t>(27) RDKit: Open-Source Cheminformatics, version 2024.03. https://www.rdkit.org (accessed 2026-09-26).</w:t>
       </w:r>
     </w:p>
     <w:p>
@@ -4792,7 +4753,7 @@
         <w:rPr>
           <w:sz w:val="20"/>
         </w:rPr>
-        <w:t>(28) RDKit: Open-Source Cheminformatics, version 2024.03. https://www.rdkit.org (accessed 2026-09-26).</w:t>
+        <w:t>(28) Pedregosa, F.; Varoquaux, G.; Gramfort, A.; Michel, V.; Thirion, B.; Grisel, O.; Blondel, M.; Prettenhofer, P.; Weiss, R.; Dubourg, V.; Vanderplas, J.; Passos, A.; Cournapeau, D.; Brucher, M.; Perrot, M.; Duchesnay, E. Scikit-learn: Machine Learning in Python. J. Mach. Learn. Res. 2011, 12, 2825–2830.</w:t>
       </w:r>
     </w:p>
     <w:p>
@@ -4804,7 +4765,46 @@
         <w:rPr>
           <w:sz w:val="20"/>
         </w:rPr>
-        <w:t>(29) Pedregosa, F.; Varoquaux, G.; Gramfort, A.; Michel, V.; Thirion, B.; Grisel, O.; Blondel, M.; Prettenhofer, P.; Weiss, R.; Dubourg, V.; Vanderplas, J.; Passos, A.; Cournapeau, D.; Brucher, M.; Perrot, M.; Duchesnay, E. Scikit-learn: Machine Learning in Python. J. Mach. Learn. Res. 2011, 12, 2825–2830.</w:t>
+        <w:t xml:space="preserve">(29) Giannozzi, P.; Andreussi, O.; Brumme, T.; Bunau, O.; Buongiorno Nardelli, M.; Calandra, M.; Car, R.; Cavazzoni, C.; Ceresoli, D.; Cococcioni, M.; Colonna, N.; Carnimeo, I.; Dal Corso, A.; de Gironcoli, S.; Delugas, P.; DiStasio, R. A.; Ferretti, A.; Floris, A.; Fratesi, G.; Fugallo, G.; Gebauer, R.; Gerstmann, U.; Giustino, F.; Gorni, T.; Jia, J.; Kawamura, M.; Ko, H.-Y.; Kokalj, A.; Küçükbenli, E.; Lazzeri, M.; Marsili, M.; Marzari, N.; Mauri, F.; Nguyen, N. L.; Nguyen, H.-V.; Otero-de-la-Roza, A.; Paulatto, L.; Poncé, S.; Rocca, D.; Sabatini, R.; Santra, B.; Schlipf, M.; Seitsonen, A. P.; Smogunov, A.; Timrov, I.; Thonhauser, T.; Umari, P.; Vast, N.; Wu, X.; Baroni, S. Advanced capabilities for materials modelling with Quantum ESPRESSO. </w:t>
+      </w:r>
+      <w:r>
+        <w:rPr>
+          <w:i/>
+          <w:sz w:val="20"/>
+        </w:rPr>
+        <w:t>J. Phys.: Condens. Matter</w:t>
+      </w:r>
+      <w:r>
+        <w:rPr>
+          <w:sz w:val="20"/>
+        </w:rPr>
+        <w:t xml:space="preserve"> </w:t>
+      </w:r>
+      <w:r>
+        <w:rPr>
+          <w:b/>
+          <w:sz w:val="20"/>
+        </w:rPr>
+        <w:t>2017</w:t>
+      </w:r>
+      <w:r>
+        <w:rPr>
+          <w:sz w:val="20"/>
+        </w:rPr>
+        <w:t xml:space="preserve">, </w:t>
+      </w:r>
+      <w:r>
+        <w:rPr>
+          <w:i/>
+          <w:sz w:val="20"/>
+        </w:rPr>
+        <w:t>29</w:t>
+      </w:r>
+      <w:r>
+        <w:rPr>
+          <w:sz w:val="20"/>
+        </w:rPr>
+        <w:t>, 465901. https://doi.org/10.1088/1361-648x/aa8f79</w:t>
       </w:r>
     </w:p>
     <w:p>
@@ -4816,14 +4816,14 @@
         <w:rPr>
           <w:sz w:val="20"/>
         </w:rPr>
-        <w:t xml:space="preserve">(30) Giannozzi, P.; Andreussi, O.; Brumme, T.; Bunau, O.; Buongiorno Nardelli, M.; Calandra, M.; Car, R.; Cavazzoni, C.; Ceresoli, D.; Cococcioni, M.; Colonna, N.; Carnimeo, I.; Dal Corso, A.; de Gironcoli, S.; Delugas, P.; DiStasio, R. A.; Ferretti, A.; Floris, A.; Fratesi, G.; Fugallo, G.; Gebauer, R.; Gerstmann, U.; Giustino, F.; Gorni, T.; Jia, J.; Kawamura, M.; Ko, H.-Y.; Kokalj, A.; Küçükbenli, E.; Lazzeri, M.; Marsili, M.; Marzari, N.; Mauri, F.; Nguyen, N. L.; Nguyen, H.-V.; Otero-de-la-Roza, A.; Paulatto, L.; Poncé, S.; Rocca, D.; Sabatini, R.; Santra, B.; Schlipf, M.; Seitsonen, A. P.; Smogunov, A.; Timrov, I.; Thonhauser, T.; Umari, P.; Vast, N.; Wu, X.; Baroni, S. Advanced capabilities for materials modelling with Quantum ESPRESSO. </w:t>
+        <w:t xml:space="preserve">(30) Perdew, J. P.; Burke, K.; Ernzerhof, M. Generalized Gradient Approximation Made Simple. </w:t>
       </w:r>
       <w:r>
         <w:rPr>
           <w:i/>
           <w:sz w:val="20"/>
         </w:rPr>
-        <w:t>J. Phys.: Condens. Matter</w:t>
+        <w:t>Phys. Rev. Lett.</w:t>
       </w:r>
       <w:r>
         <w:rPr>
@@ -4836,7 +4836,7 @@
           <w:b/>
           <w:sz w:val="20"/>
         </w:rPr>
-        <w:t>2017</w:t>
+        <w:t>1996</w:t>
       </w:r>
       <w:r>
         <w:rPr>
@@ -4849,13 +4849,13 @@
           <w:i/>
           <w:sz w:val="20"/>
         </w:rPr>
-        <w:t>29</w:t>
+        <w:t>77</w:t>
       </w:r>
       <w:r>
         <w:rPr>
           <w:sz w:val="20"/>
         </w:rPr>
-        <w:t>, 465901. https://doi.org/10.1088/1361-648x/aa8f79</w:t>
+        <w:t>, 3865–3868. https://doi.org/10.1103/physrevlett.77.3865</w:t>
       </w:r>
     </w:p>
     <w:p>
@@ -4867,14 +4867,14 @@
         <w:rPr>
           <w:sz w:val="20"/>
         </w:rPr>
-        <w:t xml:space="preserve">(31) Perdew, J. P.; Burke, K.; Ernzerhof, M. Generalized Gradient Approximation Made Simple. </w:t>
+        <w:t xml:space="preserve">(31) Grimme, S.; Antony, J.; Ehrlich, S.; Krieg, H. A consistent and accurate ab initio parametrization of density functional dispersion correction (DFT-D) for the 94 elements H-Pu. </w:t>
       </w:r>
       <w:r>
         <w:rPr>
           <w:i/>
           <w:sz w:val="20"/>
         </w:rPr>
-        <w:t>Phys. Rev. Lett.</w:t>
+        <w:t>J. Chem. Phys.</w:t>
       </w:r>
       <w:r>
         <w:rPr>
@@ -4887,7 +4887,7 @@
           <w:b/>
           <w:sz w:val="20"/>
         </w:rPr>
-        <w:t>1996</w:t>
+        <w:t>2010</w:t>
       </w:r>
       <w:r>
         <w:rPr>
@@ -4900,13 +4900,13 @@
           <w:i/>
           <w:sz w:val="20"/>
         </w:rPr>
-        <w:t>77</w:t>
+        <w:t>132</w:t>
       </w:r>
       <w:r>
         <w:rPr>
           <w:sz w:val="20"/>
         </w:rPr>
-        <w:t>, 3865–3868. https://doi.org/10.1103/physrevlett.77.3865</w:t>
+        <w:t>, 154104. https://doi.org/10.1063/1.3382344</w:t>
       </w:r>
     </w:p>
     <w:p>
@@ -4918,14 +4918,14 @@
         <w:rPr>
           <w:sz w:val="20"/>
         </w:rPr>
-        <w:t xml:space="preserve">(32) Grimme, S.; Antony, J.; Ehrlich, S.; Krieg, H. A consistent and accurate ab initio parametrization of density functional dispersion correction (DFT-D) for the 94 elements H-Pu. </w:t>
+        <w:t xml:space="preserve">(32) Strout, D. L. Structure and Stability of Boron Nitrides: Isomers of B12N12. </w:t>
       </w:r>
       <w:r>
         <w:rPr>
           <w:i/>
           <w:sz w:val="20"/>
         </w:rPr>
-        <w:t>J. Chem. Phys.</w:t>
+        <w:t>J. Phys. Chem. A</w:t>
       </w:r>
       <w:r>
         <w:rPr>
@@ -4938,7 +4938,7 @@
           <w:b/>
           <w:sz w:val="20"/>
         </w:rPr>
-        <w:t>2010</w:t>
+        <w:t>2000</w:t>
       </w:r>
       <w:r>
         <w:rPr>
@@ -4951,13 +4951,13 @@
           <w:i/>
           <w:sz w:val="20"/>
         </w:rPr>
-        <w:t>132</w:t>
+        <w:t>104</w:t>
       </w:r>
       <w:r>
         <w:rPr>
           <w:sz w:val="20"/>
         </w:rPr>
-        <w:t>, 154104. https://doi.org/10.1063/1.3382344</w:t>
+        <w:t>, 3364–3366. https://doi.org/10.1021/jp994129a</w:t>
       </w:r>
     </w:p>
     <w:p>
@@ -4969,14 +4969,14 @@
         <w:rPr>
           <w:sz w:val="20"/>
         </w:rPr>
-        <w:t xml:space="preserve">(33) Khazaei, M.; Arai, M.; Sasaki, T.; Chung, C.; Venkataramanan, N. S.; Estili, M.; Sakka, Y.; Kawazoe, Y. Novel Electronic and Magnetic Properties of Two‐Dimensional Transition Metal Carbides and Nitrides. </w:t>
+        <w:t xml:space="preserve">(33) Kroke, E.; Schwarz, M.; Horath-Bordon, E.; Kroll, P.; Noll, B.; Norman, A. D. Tri-s-triazine derivatives. Part I. From trichloro-tri-s-triazine to graphitic C3N4 structures. </w:t>
       </w:r>
       <w:r>
         <w:rPr>
           <w:i/>
           <w:sz w:val="20"/>
         </w:rPr>
-        <w:t>Adv. Funct. Mater.</w:t>
+        <w:t>New J. Chem.</w:t>
       </w:r>
       <w:r>
         <w:rPr>
@@ -4989,7 +4989,7 @@
           <w:b/>
           <w:sz w:val="20"/>
         </w:rPr>
-        <w:t>2013</w:t>
+        <w:t>2002</w:t>
       </w:r>
       <w:r>
         <w:rPr>
@@ -5002,13 +5002,13 @@
           <w:i/>
           <w:sz w:val="20"/>
         </w:rPr>
-        <w:t>23</w:t>
+        <w:t>26</w:t>
       </w:r>
       <w:r>
         <w:rPr>
           <w:sz w:val="20"/>
         </w:rPr>
-        <w:t>, 2185–2192. https://doi.org/10.1002/adfm.201202502</w:t>
+        <w:t>, 508–512. https://doi.org/10.1039/b111062b</w:t>
       </w:r>
     </w:p>
     <w:p>
@@ -5020,14 +5020,14 @@
         <w:rPr>
           <w:sz w:val="20"/>
         </w:rPr>
-        <w:t xml:space="preserve">(34) Merz, G. E.; Chalkley, M. J.; Tan, S. K.; Tse, E.; Lee, J.; Prusiner, S. B.; Paras, N. A.; DeGrado, W. F.; Southworth, D. R. Stacked binding of a PET ligand to Alzheimer’s tau paired helical filaments. </w:t>
+        <w:t xml:space="preserve">(34) Feng, B.; Zhang, J.; Zhong, Q.; Li, W.; Li, S.; Li, H.; Cheng, P.; Meng, S.; Chen, L.; Wu, K. Experimental realization of two-dimensional boron sheets. </w:t>
       </w:r>
       <w:r>
         <w:rPr>
           <w:i/>
           <w:sz w:val="20"/>
         </w:rPr>
-        <w:t>Nat. Commun.</w:t>
+        <w:t>Nat. Chem.</w:t>
       </w:r>
       <w:r>
         <w:rPr>
@@ -5040,7 +5040,7 @@
           <w:b/>
           <w:sz w:val="20"/>
         </w:rPr>
-        <w:t>2023</w:t>
+        <w:t>2016</w:t>
       </w:r>
       <w:r>
         <w:rPr>
@@ -5053,13 +5053,13 @@
           <w:i/>
           <w:sz w:val="20"/>
         </w:rPr>
-        <w:t>14</w:t>
+        <w:t>8</w:t>
       </w:r>
       <w:r>
         <w:rPr>
           <w:sz w:val="20"/>
         </w:rPr>
-        <w:t>, 3048. https://doi.org/10.1038/s41467-023-38537-y</w:t>
+        <w:t>, 563–568. https://doi.org/10.1038/nchem.2491</w:t>
       </w:r>
     </w:p>
     <w:p>
@@ -5071,7 +5071,160 @@
         <w:rPr>
           <w:sz w:val="20"/>
         </w:rPr>
-        <w:t xml:space="preserve">(35) Stamos, J.; Sliwkowski, M. X.; Eigenbrot, C. Structure of the Epidermal Growth Factor Receptor Kinase Domain Alone and in Complex with a 4-Anilinoquinazoline Inhibitor. </w:t>
+        <w:t xml:space="preserve">(35) Mannix, A. J.; Zhou, X.-F.; Kiraly, B.; Wood, J. D.; Alducin, D.; Myers, B. D.; Liu, X.; Fisher, B. L.; Santiago, U.; Guest, J. R.; Yacaman, M. J.; Ponce, A.; Oganov, A. R.; Hersam, M. C.; Guisinger, N. P. Synthesis of borophenes: Anisotropic, two-dimensional boron polymorphs. </w:t>
+      </w:r>
+      <w:r>
+        <w:rPr>
+          <w:i/>
+          <w:sz w:val="20"/>
+        </w:rPr>
+        <w:t>Science</w:t>
+      </w:r>
+      <w:r>
+        <w:rPr>
+          <w:sz w:val="20"/>
+        </w:rPr>
+        <w:t xml:space="preserve"> </w:t>
+      </w:r>
+      <w:r>
+        <w:rPr>
+          <w:b/>
+          <w:sz w:val="20"/>
+        </w:rPr>
+        <w:t>2015</w:t>
+      </w:r>
+      <w:r>
+        <w:rPr>
+          <w:sz w:val="20"/>
+        </w:rPr>
+        <w:t xml:space="preserve">, </w:t>
+      </w:r>
+      <w:r>
+        <w:rPr>
+          <w:i/>
+          <w:sz w:val="20"/>
+        </w:rPr>
+        <w:t>350</w:t>
+      </w:r>
+      <w:r>
+        <w:rPr>
+          <w:sz w:val="20"/>
+        </w:rPr>
+        <w:t>, 1513–1516. https://doi.org/10.1126/science.aad1080</w:t>
+      </w:r>
+    </w:p>
+    <w:p>
+      <w:pPr>
+        <w:spacing w:after="60"/>
+        <w:ind w:left="454" w:hanging="454"/>
+      </w:pPr>
+      <w:r>
+        <w:rPr>
+          <w:sz w:val="20"/>
+        </w:rPr>
+        <w:t xml:space="preserve">(36) Khazaei, M.; Arai, M.; Sasaki, T.; Chung, C.; Venkataramanan, N. S.; Estili, M.; Sakka, Y.; Kawazoe, Y. Novel Electronic and Magnetic Properties of Two‐Dimensional Transition Metal Carbides and Nitrides. </w:t>
+      </w:r>
+      <w:r>
+        <w:rPr>
+          <w:i/>
+          <w:sz w:val="20"/>
+        </w:rPr>
+        <w:t>Adv. Funct. Mater.</w:t>
+      </w:r>
+      <w:r>
+        <w:rPr>
+          <w:sz w:val="20"/>
+        </w:rPr>
+        <w:t xml:space="preserve"> </w:t>
+      </w:r>
+      <w:r>
+        <w:rPr>
+          <w:b/>
+          <w:sz w:val="20"/>
+        </w:rPr>
+        <w:t>2013</w:t>
+      </w:r>
+      <w:r>
+        <w:rPr>
+          <w:sz w:val="20"/>
+        </w:rPr>
+        <w:t xml:space="preserve">, </w:t>
+      </w:r>
+      <w:r>
+        <w:rPr>
+          <w:i/>
+          <w:sz w:val="20"/>
+        </w:rPr>
+        <w:t>23</w:t>
+      </w:r>
+      <w:r>
+        <w:rPr>
+          <w:sz w:val="20"/>
+        </w:rPr>
+        <w:t>, 2185–2192. https://doi.org/10.1002/adfm.201202502</w:t>
+      </w:r>
+    </w:p>
+    <w:p>
+      <w:pPr>
+        <w:spacing w:after="60"/>
+        <w:ind w:left="454" w:hanging="454"/>
+      </w:pPr>
+      <w:r>
+        <w:rPr>
+          <w:sz w:val="20"/>
+        </w:rPr>
+        <w:t xml:space="preserve">(37) Merz, G. E.; Chalkley, M. J.; Tan, S. K.; Tse, E.; Lee, J.; Prusiner, S. B.; Paras, N. A.; DeGrado, W. F.; Southworth, D. R. Stacked binding of a PET ligand to Alzheimer’s tau paired helical filaments. </w:t>
+      </w:r>
+      <w:r>
+        <w:rPr>
+          <w:i/>
+          <w:sz w:val="20"/>
+        </w:rPr>
+        <w:t>Nat. Commun.</w:t>
+      </w:r>
+      <w:r>
+        <w:rPr>
+          <w:sz w:val="20"/>
+        </w:rPr>
+        <w:t xml:space="preserve"> </w:t>
+      </w:r>
+      <w:r>
+        <w:rPr>
+          <w:b/>
+          <w:sz w:val="20"/>
+        </w:rPr>
+        <w:t>2023</w:t>
+      </w:r>
+      <w:r>
+        <w:rPr>
+          <w:sz w:val="20"/>
+        </w:rPr>
+        <w:t xml:space="preserve">, </w:t>
+      </w:r>
+      <w:r>
+        <w:rPr>
+          <w:i/>
+          <w:sz w:val="20"/>
+        </w:rPr>
+        <w:t>14</w:t>
+      </w:r>
+      <w:r>
+        <w:rPr>
+          <w:sz w:val="20"/>
+        </w:rPr>
+        <w:t>, 3048. https://doi.org/10.1038/s41467-023-38537-y</w:t>
+      </w:r>
+    </w:p>
+    <w:p>
+      <w:pPr>
+        <w:spacing w:after="60"/>
+        <w:ind w:left="454" w:hanging="454"/>
+      </w:pPr>
+      <w:r>
+        <w:rPr>
+          <w:sz w:val="20"/>
+        </w:rPr>
+        <w:t xml:space="preserve">(38) Stamos, J.; Sliwkowski, M. X.; Eigenbrot, C. Structure of the Epidermal Growth Factor Receptor Kinase Domain Alone and in Complex with a 4-Anilinoquinazoline Inhibitor. </w:t>
       </w:r>
       <w:r>
         <w:rPr>

</xml_diff>

<commit_message>
Replace unverified Khazaei 2013 lattice attribution with own PBE-D3 primitive-cell value (3.022 Å)
Co-Authored-By: Claude Opus 5.5 <noreply@anthropic.com>
</commit_message>
<xml_diff>
--- a/manuscript/submission/Manuscript_Audit_JCBC.docx
+++ b/manuscript/submission/Manuscript_Audit_JCBC.docx
@@ -2352,17 +2352,7 @@
       </w:r>
       <w:r>
         <w:rPr/>
-        <w:t xml:space="preserve"> at a = 2.70 Å, 11% below the lattice constant of the material (3.03 Å</w:t>
-      </w:r>
-      <w:r>
-        <w:rPr>
-          <w:vertAlign w:val="superscript"/>
-        </w:rPr>
-        <w:t>36</w:t>
-      </w:r>
-      <w:r>
-        <w:rPr/>
-        <w:t>), with a jump of 31.0 eV per formula unit between neighbouring points; GFN1-xTB failed to converge at 6 of 14 lattice constants and gave unphysical energies at 2 more (Fig. 4a). Finite flakes fared no better: 1 of 18 calculations on neutral flakes converged (Fig. 4b). Both methods were parametrized mainly on molecular data</w:t>
+        <w:t xml:space="preserve"> at a = 2.70 Å, 11% below the PBE-D3 lattice constant of the material (3.02 Å, computed here for the primitive cell with the settings of the case study), with a jump of 31.0 eV per formula unit between neighbouring points; GFN1-xTB failed to converge at 6 of 14 lattice constants and gave unphysical energies at 2 more (Fig. 4a). Finite flakes fared no better: 1 of 18 calculations on neutral flakes converged (Fig. 4b). Both methods were parametrized mainly on molecular data</w:t>
       </w:r>
       <w:r>
         <w:rPr>
@@ -2476,7 +2466,7 @@
         <w:rPr>
           <w:sz w:val="20"/>
         </w:rPr>
-        <w:t>. (a) Energy of a periodic 4×4 slab against the in-plane lattice constant with GFN2-xTB and GFN1-xTB; crosses, failed or unphysical SCF; dotted line, experimental and DFT lattice constant. (b) Calculations on finite flakes attempted and converged, for neutral and charged flakes.</w:t>
+        <w:t>. (a) Energy of a periodic 4×4 slab against the in-plane lattice constant with GFN2-xTB and GFN1-xTB; crosses, failed or unphysical SCF; dotted line, PBE-D3 lattice constant computed for the primitive cell. (b) Calculations on finite flakes attempted and converged, for neutral and charged flakes.</w:t>
       </w:r>
     </w:p>
     <w:p>
@@ -2501,7 +2491,7 @@
         <w:rPr>
           <w:vertAlign w:val="superscript"/>
         </w:rPr>
-        <w:t>37</w:t>
+        <w:t>36</w:t>
       </w:r>
       <w:r>
         <w:rPr/>
@@ -2511,7 +2501,7 @@
         <w:rPr>
           <w:vertAlign w:val="superscript"/>
         </w:rPr>
-        <w:t>38</w:t>
+        <w:t>37</w:t>
       </w:r>
       <w:r>
         <w:rPr/>
@@ -5122,14 +5112,14 @@
         <w:rPr>
           <w:sz w:val="20"/>
         </w:rPr>
-        <w:t xml:space="preserve">(36) Khazaei, M.; Arai, M.; Sasaki, T.; Chung, C.; Venkataramanan, N. S.; Estili, M.; Sakka, Y.; Kawazoe, Y. Novel Electronic and Magnetic Properties of Two‐Dimensional Transition Metal Carbides and Nitrides. </w:t>
+        <w:t xml:space="preserve">(36) Merz, G. E.; Chalkley, M. J.; Tan, S. K.; Tse, E.; Lee, J.; Prusiner, S. B.; Paras, N. A.; DeGrado, W. F.; Southworth, D. R. Stacked binding of a PET ligand to Alzheimer’s tau paired helical filaments. </w:t>
       </w:r>
       <w:r>
         <w:rPr>
           <w:i/>
           <w:sz w:val="20"/>
         </w:rPr>
-        <w:t>Adv. Funct. Mater.</w:t>
+        <w:t>Nat. Commun.</w:t>
       </w:r>
       <w:r>
         <w:rPr>
@@ -5142,7 +5132,7 @@
           <w:b/>
           <w:sz w:val="20"/>
         </w:rPr>
-        <w:t>2013</w:t>
+        <w:t>2023</w:t>
       </w:r>
       <w:r>
         <w:rPr>
@@ -5155,13 +5145,13 @@
           <w:i/>
           <w:sz w:val="20"/>
         </w:rPr>
-        <w:t>23</w:t>
+        <w:t>14</w:t>
       </w:r>
       <w:r>
         <w:rPr>
           <w:sz w:val="20"/>
         </w:rPr>
-        <w:t>, 2185–2192. https://doi.org/10.1002/adfm.201202502</w:t>
+        <w:t>, 3048. https://doi.org/10.1038/s41467-023-38537-y</w:t>
       </w:r>
     </w:p>
     <w:p>
@@ -5173,58 +5163,7 @@
         <w:rPr>
           <w:sz w:val="20"/>
         </w:rPr>
-        <w:t xml:space="preserve">(37) Merz, G. E.; Chalkley, M. J.; Tan, S. K.; Tse, E.; Lee, J.; Prusiner, S. B.; Paras, N. A.; DeGrado, W. F.; Southworth, D. R. Stacked binding of a PET ligand to Alzheimer’s tau paired helical filaments. </w:t>
-      </w:r>
-      <w:r>
-        <w:rPr>
-          <w:i/>
-          <w:sz w:val="20"/>
-        </w:rPr>
-        <w:t>Nat. Commun.</w:t>
-      </w:r>
-      <w:r>
-        <w:rPr>
-          <w:sz w:val="20"/>
-        </w:rPr>
-        <w:t xml:space="preserve"> </w:t>
-      </w:r>
-      <w:r>
-        <w:rPr>
-          <w:b/>
-          <w:sz w:val="20"/>
-        </w:rPr>
-        <w:t>2023</w:t>
-      </w:r>
-      <w:r>
-        <w:rPr>
-          <w:sz w:val="20"/>
-        </w:rPr>
-        <w:t xml:space="preserve">, </w:t>
-      </w:r>
-      <w:r>
-        <w:rPr>
-          <w:i/>
-          <w:sz w:val="20"/>
-        </w:rPr>
-        <w:t>14</w:t>
-      </w:r>
-      <w:r>
-        <w:rPr>
-          <w:sz w:val="20"/>
-        </w:rPr>
-        <w:t>, 3048. https://doi.org/10.1038/s41467-023-38537-y</w:t>
-      </w:r>
-    </w:p>
-    <w:p>
-      <w:pPr>
-        <w:spacing w:after="60"/>
-        <w:ind w:left="454" w:hanging="454"/>
-      </w:pPr>
-      <w:r>
-        <w:rPr>
-          <w:sz w:val="20"/>
-        </w:rPr>
-        <w:t xml:space="preserve">(38) Stamos, J.; Sliwkowski, M. X.; Eigenbrot, C. Structure of the Epidermal Growth Factor Receptor Kinase Domain Alone and in Complex with a 4-Anilinoquinazoline Inhibitor. </w:t>
+        <w:t xml:space="preserve">(37) Stamos, J.; Sliwkowski, M. X.; Eigenbrot, C. Structure of the Epidermal Growth Factor Receptor Kinase Domain Alone and in Complex with a 4-Anilinoquinazoline Inhibitor. </w:t>
       </w:r>
       <w:r>
         <w:rPr>

</xml_diff>